<commit_message>
feat: update CV, GDCCS certification, and Teleperformance experience
</commit_message>
<xml_diff>
--- a/public/Mohamed_Magdy_CV.docx
+++ b/public/Mohamed_Magdy_CV.docx
@@ -134,11 +134,9 @@
           <w:lang w:val="fr-FR"/>
         </w:rPr>
       </w:pPr>
-      <w:proofErr w:type="gramStart"/>
       <w:r>
-        <w:t>Dubai,UAE</w:t>
+        <w:t>DUBAI, UAE</w:t>
       </w:r>
-      <w:proofErr w:type="gramEnd"/>
       <w:r>
         <w:rPr>
           <w:lang w:val="fr-FR"/>
@@ -267,14 +265,12 @@
         </w:rPr>
         <w:t xml:space="preserve">With </w:t>
       </w:r>
-      <w:proofErr w:type="gramStart"/>
       <w:r>
         <w:rPr>
           <w:rFonts w:ascii="Times New Roman" w:hAnsi="Times New Roman" w:cs="Times New Roman"/>
         </w:rPr>
-        <w:t>over-all</w:t>
+        <w:t>overall</w:t>
       </w:r>
-      <w:proofErr w:type="gramEnd"/>
       <w:r>
         <w:rPr>
           <w:rFonts w:ascii="Times New Roman" w:hAnsi="Times New Roman" w:cs="Times New Roman"/>
@@ -361,28 +357,24 @@
         </w:rPr>
         <w:t xml:space="preserve">Enthusiastic </w:t>
       </w:r>
-      <w:proofErr w:type="gramStart"/>
       <w:r>
         <w:rPr>
           <w:rFonts w:ascii="Times New Roman" w:hAnsi="Times New Roman" w:cs="Times New Roman"/>
         </w:rPr>
         <w:t>on</w:t>
       </w:r>
-      <w:proofErr w:type="gramEnd"/>
       <w:r>
         <w:rPr>
           <w:rFonts w:ascii="Times New Roman" w:hAnsi="Times New Roman" w:cs="Times New Roman"/>
         </w:rPr>
         <w:t xml:space="preserve"> enhancing </w:t>
       </w:r>
-      <w:proofErr w:type="gramStart"/>
       <w:r>
         <w:rPr>
           <w:rFonts w:ascii="Times New Roman" w:hAnsi="Times New Roman" w:cs="Times New Roman"/>
         </w:rPr>
-        <w:t>the customer</w:t>
+        <w:t>customer</w:t>
       </w:r>
-      <w:proofErr w:type="gramEnd"/>
       <w:r>
         <w:rPr>
           <w:rFonts w:ascii="Times New Roman" w:hAnsi="Times New Roman" w:cs="Times New Roman"/>
@@ -399,21 +391,7 @@
         <w:rPr>
           <w:rFonts w:ascii="Times New Roman" w:hAnsi="Times New Roman" w:cs="Times New Roman"/>
         </w:rPr>
-        <w:t xml:space="preserve">ith reliable product </w:t>
-      </w:r>
-      <w:proofErr w:type="gramStart"/>
-      <w:r>
-        <w:rPr>
-          <w:rFonts w:ascii="Times New Roman" w:hAnsi="Times New Roman" w:cs="Times New Roman"/>
-        </w:rPr>
-        <w:t>education</w:t>
-      </w:r>
-      <w:proofErr w:type="gramEnd"/>
-      <w:r>
-        <w:rPr>
-          <w:rFonts w:ascii="Times New Roman" w:hAnsi="Times New Roman" w:cs="Times New Roman"/>
-        </w:rPr>
-        <w:t>, timely assistance, helpful feedback, and respectful conflict management response. Confident communicator with the ability to lead colleagues, respond to customer inquiries, and mediate conflict. Passionate about creating organizational success and improving brand reputation through serving customers in a truly memorable way</w:t>
+        <w:t>ith reliable product education, timely assistance, helpful feedback, and respectful conflict management response. Confident communicator with the ability to lead colleagues, respond to customer inquiries, and mediate conflict. Passionate about creating organizational success and improving brand reputation through serving customers in a truly memorable way</w:t>
       </w:r>
       <w:r>
         <w:rPr>
@@ -833,7 +811,6 @@
         </w:rPr>
         <w:t xml:space="preserve">onitoring agent’s skills and advise for </w:t>
       </w:r>
-      <w:proofErr w:type="gramStart"/>
       <w:r>
         <w:rPr>
           <w:rFonts w:ascii="Segoe UI" w:eastAsia="Times New Roman" w:hAnsi="Segoe UI" w:cs="Segoe UI"/>
@@ -862,17 +839,6 @@
           <w:szCs w:val="16"/>
           <w:lang w:eastAsia="en-US"/>
         </w:rPr>
-        <w:t>,</w:t>
-      </w:r>
-      <w:proofErr w:type="gramEnd"/>
-      <w:r>
-        <w:rPr>
-          <w:rFonts w:ascii="Segoe UI" w:eastAsia="Times New Roman" w:hAnsi="Segoe UI" w:cs="Segoe UI"/>
-          <w:color w:val="212529"/>
-          <w:sz w:val="16"/>
-          <w:szCs w:val="16"/>
-          <w:lang w:eastAsia="en-US"/>
-        </w:rPr>
         <w:t xml:space="preserve"> m</w:t>
       </w:r>
       <w:r>
@@ -885,7 +851,6 @@
         </w:rPr>
         <w:t xml:space="preserve">anaging and </w:t>
       </w:r>
-      <w:proofErr w:type="gramStart"/>
       <w:r>
         <w:rPr>
           <w:rFonts w:ascii="Segoe UI" w:eastAsia="Times New Roman" w:hAnsi="Segoe UI" w:cs="Segoe UI"/>
@@ -894,9 +859,8 @@
           <w:szCs w:val="16"/>
           <w:lang w:eastAsia="en-US"/>
         </w:rPr>
-        <w:t>Securing</w:t>
+        <w:t>securing</w:t>
       </w:r>
-      <w:proofErr w:type="gramEnd"/>
       <w:r>
         <w:rPr>
           <w:rFonts w:ascii="Segoe UI" w:eastAsia="Times New Roman" w:hAnsi="Segoe UI" w:cs="Segoe UI"/>
@@ -1098,7 +1062,6 @@
         </w:rPr>
         <w:t xml:space="preserve">Manages and </w:t>
       </w:r>
-      <w:proofErr w:type="gramStart"/>
       <w:r>
         <w:rPr>
           <w:rFonts w:ascii="Segoe UI" w:eastAsia="Times New Roman" w:hAnsi="Segoe UI" w:cs="Segoe UI"/>
@@ -1109,7 +1072,6 @@
         </w:rPr>
         <w:t>monitor</w:t>
       </w:r>
-      <w:proofErr w:type="gramEnd"/>
       <w:r>
         <w:rPr>
           <w:rFonts w:ascii="Segoe UI" w:eastAsia="Times New Roman" w:hAnsi="Segoe UI" w:cs="Segoe UI"/>
@@ -1258,18 +1220,7 @@
           <w:szCs w:val="16"/>
           <w:lang w:eastAsia="en-US"/>
         </w:rPr>
-        <w:t xml:space="preserve">and </w:t>
-      </w:r>
-      <w:proofErr w:type="gramStart"/>
-      <w:r>
-        <w:rPr>
-          <w:rFonts w:ascii="Segoe UI" w:eastAsia="Times New Roman" w:hAnsi="Segoe UI" w:cs="Segoe UI"/>
-          <w:color w:val="212529"/>
-          <w:sz w:val="16"/>
-          <w:szCs w:val="16"/>
-          <w:lang w:eastAsia="en-US"/>
-        </w:rPr>
-        <w:t>e</w:t>
+        <w:t>and e</w:t>
       </w:r>
       <w:r>
         <w:rPr>
@@ -1279,18 +1230,7 @@
           <w:szCs w:val="16"/>
           <w:lang w:eastAsia="en-US"/>
         </w:rPr>
-        <w:t>valuating</w:t>
-      </w:r>
-      <w:proofErr w:type="gramEnd"/>
-      <w:r>
-        <w:rPr>
-          <w:rFonts w:ascii="Segoe UI" w:eastAsia="Times New Roman" w:hAnsi="Segoe UI" w:cs="Segoe UI"/>
-          <w:color w:val="212529"/>
-          <w:sz w:val="16"/>
-          <w:szCs w:val="16"/>
-          <w:lang w:eastAsia="en-US"/>
-        </w:rPr>
-        <w:t xml:space="preserve"> supply options and issuance of orders and approving purchases.</w:t>
+        <w:t>valuating supply options and issuance of orders and approving purchases.</w:t>
       </w:r>
     </w:p>
     <w:p>
@@ -1313,6 +1253,9 @@
           <w:numId w:val="16"/>
         </w:numPr>
       </w:pPr>
+      <w:r>
+        <w:t xml:space="preserve">Senior Inbound, </w:t>
+      </w:r>
       <w:r>
         <w:t>Outbound</w:t>
       </w:r>
@@ -1515,7 +1458,6 @@
         </w:rPr>
         <w:t xml:space="preserve">, </w:t>
       </w:r>
-      <w:proofErr w:type="gramStart"/>
       <w:r>
         <w:rPr>
           <w:rFonts w:ascii="Segoe UI" w:eastAsia="Times New Roman" w:hAnsi="Segoe UI" w:cs="Segoe UI"/>
@@ -1534,40 +1476,7 @@
           <w:szCs w:val="16"/>
           <w:lang w:eastAsia="en-US"/>
         </w:rPr>
-        <w:t>perate</w:t>
-      </w:r>
-      <w:proofErr w:type="gramEnd"/>
-      <w:r>
-        <w:rPr>
-          <w:rFonts w:ascii="Segoe UI" w:eastAsia="Times New Roman" w:hAnsi="Segoe UI" w:cs="Segoe UI"/>
-          <w:color w:val="212529"/>
-          <w:sz w:val="16"/>
-          <w:szCs w:val="16"/>
-          <w:lang w:eastAsia="en-US"/>
-        </w:rPr>
-        <w:t xml:space="preserve"> and </w:t>
-      </w:r>
-      <w:proofErr w:type="gramStart"/>
-      <w:r>
-        <w:rPr>
-          <w:rFonts w:ascii="Segoe UI" w:eastAsia="Times New Roman" w:hAnsi="Segoe UI" w:cs="Segoe UI"/>
-          <w:color w:val="212529"/>
-          <w:sz w:val="16"/>
-          <w:szCs w:val="16"/>
-          <w:lang w:eastAsia="en-US"/>
-        </w:rPr>
-        <w:t>troubleshoot</w:t>
-      </w:r>
-      <w:proofErr w:type="gramEnd"/>
-      <w:r>
-        <w:rPr>
-          <w:rFonts w:ascii="Segoe UI" w:eastAsia="Times New Roman" w:hAnsi="Segoe UI" w:cs="Segoe UI"/>
-          <w:color w:val="212529"/>
-          <w:sz w:val="16"/>
-          <w:szCs w:val="16"/>
-          <w:lang w:eastAsia="en-US"/>
-        </w:rPr>
-        <w:t xml:space="preserve"> computer system and application problems</w:t>
+        <w:t>perate and troubleshoot computer system and application problems</w:t>
       </w:r>
       <w:r>
         <w:rPr>
@@ -1657,18 +1566,7 @@
           <w:szCs w:val="16"/>
           <w:lang w:eastAsia="en-US"/>
         </w:rPr>
-        <w:t xml:space="preserve">, </w:t>
-      </w:r>
-      <w:proofErr w:type="gramStart"/>
-      <w:r>
-        <w:rPr>
-          <w:rFonts w:ascii="Segoe UI" w:eastAsia="Times New Roman" w:hAnsi="Segoe UI" w:cs="Segoe UI"/>
-          <w:color w:val="212529"/>
-          <w:sz w:val="16"/>
-          <w:szCs w:val="16"/>
-          <w:lang w:eastAsia="en-US"/>
-        </w:rPr>
-        <w:t>i</w:t>
+        <w:t>, i</w:t>
       </w:r>
       <w:r>
         <w:rPr>
@@ -1678,62 +1576,7 @@
           <w:szCs w:val="16"/>
           <w:lang w:eastAsia="en-US"/>
         </w:rPr>
-        <w:t>nterpret</w:t>
-      </w:r>
-      <w:proofErr w:type="gramEnd"/>
-      <w:r>
-        <w:rPr>
-          <w:rFonts w:ascii="Segoe UI" w:eastAsia="Times New Roman" w:hAnsi="Segoe UI" w:cs="Segoe UI"/>
-          <w:color w:val="212529"/>
-          <w:sz w:val="16"/>
-          <w:szCs w:val="16"/>
-          <w:lang w:eastAsia="en-US"/>
-        </w:rPr>
-        <w:t xml:space="preserve">, </w:t>
-      </w:r>
-      <w:proofErr w:type="gramStart"/>
-      <w:r>
-        <w:rPr>
-          <w:rFonts w:ascii="Segoe UI" w:eastAsia="Times New Roman" w:hAnsi="Segoe UI" w:cs="Segoe UI"/>
-          <w:color w:val="212529"/>
-          <w:sz w:val="16"/>
-          <w:szCs w:val="16"/>
-          <w:lang w:eastAsia="en-US"/>
-        </w:rPr>
-        <w:t>explain</w:t>
-      </w:r>
-      <w:proofErr w:type="gramEnd"/>
-      <w:r>
-        <w:rPr>
-          <w:rFonts w:ascii="Segoe UI" w:eastAsia="Times New Roman" w:hAnsi="Segoe UI" w:cs="Segoe UI"/>
-          <w:color w:val="212529"/>
-          <w:sz w:val="16"/>
-          <w:szCs w:val="16"/>
-          <w:lang w:eastAsia="en-US"/>
-        </w:rPr>
-        <w:t xml:space="preserve">, and </w:t>
-      </w:r>
-      <w:proofErr w:type="gramStart"/>
-      <w:r>
-        <w:rPr>
-          <w:rFonts w:ascii="Segoe UI" w:eastAsia="Times New Roman" w:hAnsi="Segoe UI" w:cs="Segoe UI"/>
-          <w:color w:val="212529"/>
-          <w:sz w:val="16"/>
-          <w:szCs w:val="16"/>
-          <w:lang w:eastAsia="en-US"/>
-        </w:rPr>
-        <w:t>enforce</w:t>
-      </w:r>
-      <w:proofErr w:type="gramEnd"/>
-      <w:r>
-        <w:rPr>
-          <w:rFonts w:ascii="Segoe UI" w:eastAsia="Times New Roman" w:hAnsi="Segoe UI" w:cs="Segoe UI"/>
-          <w:color w:val="212529"/>
-          <w:sz w:val="16"/>
-          <w:szCs w:val="16"/>
-          <w:lang w:eastAsia="en-US"/>
-        </w:rPr>
-        <w:t xml:space="preserve"> department policies and procedures</w:t>
+        <w:t>nterpret, explain, and enforce department policies and procedures</w:t>
       </w:r>
       <w:r>
         <w:rPr>
@@ -1745,7 +1588,6 @@
         </w:rPr>
         <w:t xml:space="preserve"> and </w:t>
       </w:r>
-      <w:proofErr w:type="gramStart"/>
       <w:r>
         <w:rPr>
           <w:rFonts w:ascii="Segoe UI" w:eastAsia="Times New Roman" w:hAnsi="Segoe UI" w:cs="Segoe UI"/>
@@ -1754,9 +1596,8 @@
           <w:szCs w:val="16"/>
           <w:lang w:eastAsia="en-US"/>
         </w:rPr>
-        <w:t>Achieving</w:t>
+        <w:t>achieving</w:t>
       </w:r>
-      <w:proofErr w:type="gramEnd"/>
       <w:r>
         <w:rPr>
           <w:rFonts w:ascii="Segoe UI" w:eastAsia="Times New Roman" w:hAnsi="Segoe UI" w:cs="Segoe UI"/>
@@ -1852,7 +1693,6 @@
         </w:rPr>
         <w:t xml:space="preserve"> and </w:t>
       </w:r>
-      <w:proofErr w:type="gramStart"/>
       <w:r>
         <w:rPr>
           <w:rFonts w:ascii="Segoe UI" w:eastAsia="Times New Roman" w:hAnsi="Segoe UI" w:cs="Segoe UI"/>
@@ -1861,9 +1701,8 @@
           <w:szCs w:val="16"/>
           <w:lang w:eastAsia="en-US"/>
         </w:rPr>
-        <w:t>Provide</w:t>
+        <w:t>provide</w:t>
       </w:r>
-      <w:proofErr w:type="gramEnd"/>
       <w:r>
         <w:rPr>
           <w:rFonts w:ascii="Segoe UI" w:eastAsia="Times New Roman" w:hAnsi="Segoe UI" w:cs="Segoe UI"/>
@@ -1975,7 +1814,6 @@
         </w:rPr>
         <w:t xml:space="preserve"> and </w:t>
       </w:r>
-      <w:proofErr w:type="gramStart"/>
       <w:r>
         <w:rPr>
           <w:rFonts w:ascii="Segoe UI" w:eastAsia="Times New Roman" w:hAnsi="Segoe UI" w:cs="Segoe UI"/>
@@ -1984,9 +1822,8 @@
           <w:szCs w:val="16"/>
           <w:lang w:eastAsia="en-US"/>
         </w:rPr>
-        <w:t>Provide</w:t>
+        <w:t>provide</w:t>
       </w:r>
-      <w:proofErr w:type="gramEnd"/>
       <w:r>
         <w:rPr>
           <w:rFonts w:ascii="Segoe UI" w:eastAsia="Times New Roman" w:hAnsi="Segoe UI" w:cs="Segoe UI"/>
@@ -2331,12 +2168,10 @@
         <w:t xml:space="preserve">ith </w:t>
       </w:r>
       <w:proofErr w:type="spellStart"/>
-      <w:proofErr w:type="gramStart"/>
       <w:r>
         <w:t>MS.Excel</w:t>
       </w:r>
       <w:proofErr w:type="spellEnd"/>
-      <w:proofErr w:type="gramEnd"/>
       <w:r>
         <w:t>, I</w:t>
       </w:r>
@@ -29069,7 +28904,6 @@
     <w:sig w:usb0="E4002EFF" w:usb1="C200247B" w:usb2="00000009" w:usb3="00000000" w:csb0="000001FF" w:csb1="00000000"/>
   </w:font>
   <w:font w:name="MS Mincho">
-    <w:altName w:val="ＭＳ 明朝"/>
     <w:panose1 w:val="02020609040205080304"/>
     <w:charset w:val="80"/>
     <w:family w:val="modern"/>
@@ -29171,6 +29005,8 @@
     <w:rsid w:val="00AE5960"/>
     <w:rsid w:val="00B264C1"/>
     <w:rsid w:val="00BC46F8"/>
+    <w:rsid w:val="00C63374"/>
+    <w:rsid w:val="00F27B0E"/>
   </w:rsids>
   <m:mathPr>
     <m:mathFont m:val="Cambria Math"/>
@@ -29893,6 +29729,35 @@
 </file>
 
 <file path=customXml/item1.xml><?xml version="1.0" encoding="utf-8"?>
+<?mso-contentType ?>
+<FormTemplates xmlns="http://schemas.microsoft.com/sharepoint/v3/contenttype/forms">
+  <Display>DocumentLibraryForm</Display>
+  <Edit>DocumentLibraryForm</Edit>
+  <New>DocumentLibraryForm</New>
+</FormTemplates>
+</file>
+
+<file path=customXml/item2.xml><?xml version="1.0" encoding="utf-8"?>
+<p:properties xmlns:p="http://schemas.microsoft.com/office/2006/metadata/properties" xmlns:xsi="http://www.w3.org/2001/XMLSchema-instance" xmlns:pc="http://schemas.microsoft.com/office/infopath/2007/PartnerControls">
+  <documentManagement>
+    <Background xmlns="71af3243-3dd4-4a8d-8c0d-dd76da1f02a5">false</Background>
+    <Status xmlns="71af3243-3dd4-4a8d-8c0d-dd76da1f02a5">Not started</Status>
+    <_ip_UnifiedCompliancePolicyUIAction xmlns="http://schemas.microsoft.com/sharepoint/v3" xsi:nil="true"/>
+    <Image xmlns="71af3243-3dd4-4a8d-8c0d-dd76da1f02a5">
+      <Url xsi:nil="true"/>
+      <Description xsi:nil="true"/>
+    </Image>
+    <_ip_UnifiedCompliancePolicyProperties xmlns="http://schemas.microsoft.com/sharepoint/v3" xsi:nil="true"/>
+    <ImageTagsTaxHTField xmlns="71af3243-3dd4-4a8d-8c0d-dd76da1f02a5">
+      <Terms xmlns="http://schemas.microsoft.com/office/infopath/2007/PartnerControls"/>
+    </ImageTagsTaxHTField>
+    <TaxCatchAll xmlns="230e9df3-be65-4c73-a93b-d1236ebd677e" xsi:nil="true"/>
+    <MediaServiceKeyPoints xmlns="71af3243-3dd4-4a8d-8c0d-dd76da1f02a5" xsi:nil="true"/>
+  </documentManagement>
+</p:properties>
+</file>
+
+<file path=customXml/item3.xml><?xml version="1.0" encoding="utf-8"?>
 <ct:contentTypeSchema xmlns:ct="http://schemas.microsoft.com/office/2006/metadata/contentType" xmlns:ma="http://schemas.microsoft.com/office/2006/metadata/properties/metaAttributes" ct:_="" ma:_="" ma:contentTypeName="Document" ma:contentTypeID="0x01010079F111ED35F8CC479449609E8A0923A6" ma:contentTypeVersion="28" ma:contentTypeDescription="Create a new document." ma:contentTypeScope="" ma:versionID="60f5a4f2d2b0abadcf532d48ebf9cb71">
   <xsd:schema xmlns:xsd="http://www.w3.org/2001/XMLSchema" xmlns:xs="http://www.w3.org/2001/XMLSchema" xmlns:p="http://schemas.microsoft.com/office/2006/metadata/properties" xmlns:ns1="http://schemas.microsoft.com/sharepoint/v3" xmlns:ns2="71af3243-3dd4-4a8d-8c0d-dd76da1f02a5" xmlns:ns3="16c05727-aa75-4e4a-9b5f-8a80a1165891" xmlns:ns4="230e9df3-be65-4c73-a93b-d1236ebd677e" targetNamespace="http://schemas.microsoft.com/office/2006/metadata/properties" ma:root="true" ma:fieldsID="7dd78129e6a1811f84807ad11c651531" ns1:_="" ns2:_="" ns3:_="" ns4:_="">
     <xsd:import namespace="http://schemas.microsoft.com/sharepoint/v3"/>
@@ -30204,36 +30069,27 @@
 </ct:contentTypeSchema>
 </file>
 
-<file path=customXml/item2.xml><?xml version="1.0" encoding="utf-8"?>
-<p:properties xmlns:p="http://schemas.microsoft.com/office/2006/metadata/properties" xmlns:xsi="http://www.w3.org/2001/XMLSchema-instance" xmlns:pc="http://schemas.microsoft.com/office/infopath/2007/PartnerControls">
-  <documentManagement>
-    <Background xmlns="71af3243-3dd4-4a8d-8c0d-dd76da1f02a5">false</Background>
-    <Status xmlns="71af3243-3dd4-4a8d-8c0d-dd76da1f02a5">Not started</Status>
-    <_ip_UnifiedCompliancePolicyUIAction xmlns="http://schemas.microsoft.com/sharepoint/v3" xsi:nil="true"/>
-    <Image xmlns="71af3243-3dd4-4a8d-8c0d-dd76da1f02a5">
-      <Url xsi:nil="true"/>
-      <Description xsi:nil="true"/>
-    </Image>
-    <_ip_UnifiedCompliancePolicyProperties xmlns="http://schemas.microsoft.com/sharepoint/v3" xsi:nil="true"/>
-    <ImageTagsTaxHTField xmlns="71af3243-3dd4-4a8d-8c0d-dd76da1f02a5">
-      <Terms xmlns="http://schemas.microsoft.com/office/infopath/2007/PartnerControls"/>
-    </ImageTagsTaxHTField>
-    <TaxCatchAll xmlns="230e9df3-be65-4c73-a93b-d1236ebd677e" xsi:nil="true"/>
-    <MediaServiceKeyPoints xmlns="71af3243-3dd4-4a8d-8c0d-dd76da1f02a5" xsi:nil="true"/>
-  </documentManagement>
-</p:properties>
+<file path=customXml/itemProps1.xml><?xml version="1.0" encoding="utf-8"?>
+<ds:datastoreItem xmlns:ds="http://schemas.openxmlformats.org/officeDocument/2006/customXml" ds:itemID="{5D9ED3FD-0EE3-43B5-B701-56BB60CEE482}">
+  <ds:schemaRefs>
+    <ds:schemaRef ds:uri="http://schemas.microsoft.com/sharepoint/v3/contenttype/forms"/>
+  </ds:schemaRefs>
+</ds:datastoreItem>
 </file>
 
-<file path=customXml/item3.xml><?xml version="1.0" encoding="utf-8"?>
-<?mso-contentType ?>
-<FormTemplates xmlns="http://schemas.microsoft.com/sharepoint/v3/contenttype/forms">
-  <Display>DocumentLibraryForm</Display>
-  <Edit>DocumentLibraryForm</Edit>
-  <New>DocumentLibraryForm</New>
-</FormTemplates>
+<file path=customXml/itemProps2.xml><?xml version="1.0" encoding="utf-8"?>
+<ds:datastoreItem xmlns:ds="http://schemas.openxmlformats.org/officeDocument/2006/customXml" ds:itemID="{2B9F8D08-1D9B-4293-B753-AE33123B7366}">
+  <ds:schemaRefs>
+    <ds:schemaRef ds:uri="http://schemas.microsoft.com/office/2006/metadata/properties"/>
+    <ds:schemaRef ds:uri="http://schemas.microsoft.com/office/infopath/2007/PartnerControls"/>
+    <ds:schemaRef ds:uri="71af3243-3dd4-4a8d-8c0d-dd76da1f02a5"/>
+    <ds:schemaRef ds:uri="http://schemas.microsoft.com/sharepoint/v3"/>
+    <ds:schemaRef ds:uri="230e9df3-be65-4c73-a93b-d1236ebd677e"/>
+  </ds:schemaRefs>
+</ds:datastoreItem>
 </file>
 
-<file path=customXml/itemProps1.xml><?xml version="1.0" encoding="utf-8"?>
+<file path=customXml/itemProps3.xml><?xml version="1.0" encoding="utf-8"?>
 <ds:datastoreItem xmlns:ds="http://schemas.openxmlformats.org/officeDocument/2006/customXml" ds:itemID="{2770E34E-A33B-4329-A757-261138F33356}">
   <ds:schemaRefs>
     <ds:schemaRef ds:uri="http://schemas.microsoft.com/office/2006/metadata/contentType"/>
@@ -30254,26 +30110,6 @@
 </ds:datastoreItem>
 </file>
 
-<file path=customXml/itemProps2.xml><?xml version="1.0" encoding="utf-8"?>
-<ds:datastoreItem xmlns:ds="http://schemas.openxmlformats.org/officeDocument/2006/customXml" ds:itemID="{2B9F8D08-1D9B-4293-B753-AE33123B7366}">
-  <ds:schemaRefs>
-    <ds:schemaRef ds:uri="http://schemas.microsoft.com/office/2006/metadata/properties"/>
-    <ds:schemaRef ds:uri="http://schemas.microsoft.com/office/infopath/2007/PartnerControls"/>
-    <ds:schemaRef ds:uri="71af3243-3dd4-4a8d-8c0d-dd76da1f02a5"/>
-    <ds:schemaRef ds:uri="http://schemas.microsoft.com/sharepoint/v3"/>
-    <ds:schemaRef ds:uri="230e9df3-be65-4c73-a93b-d1236ebd677e"/>
-  </ds:schemaRefs>
-</ds:datastoreItem>
-</file>
-
-<file path=customXml/itemProps3.xml><?xml version="1.0" encoding="utf-8"?>
-<ds:datastoreItem xmlns:ds="http://schemas.openxmlformats.org/officeDocument/2006/customXml" ds:itemID="{5D9ED3FD-0EE3-43B5-B701-56BB60CEE482}">
-  <ds:schemaRefs>
-    <ds:schemaRef ds:uri="http://schemas.microsoft.com/sharepoint/v3/contenttype/forms"/>
-  </ds:schemaRefs>
-</ds:datastoreItem>
-</file>
-
 <file path=docMetadata/LabelInfo.xml><?xml version="1.0" encoding="utf-8"?>
 <clbl:labelList xmlns:clbl="http://schemas.microsoft.com/office/2020/mipLabelMetadata"/>
 </file>
</xml_diff>